<commit_message>
final document to submit
</commit_message>
<xml_diff>
--- a/Final Project - Graph Algorithms in Network Optimization.docx
+++ b/Final Project - Graph Algorithms in Network Optimization.docx
@@ -1550,19 +1550,11 @@
           <w:rFonts w:ascii="Times New Roman" w:hAnsi="Times New Roman" w:cs="Times New Roman"/>
         </w:rPr>
       </w:pPr>
-      <w:proofErr w:type="spellStart"/>
-      <w:r>
-        <w:rPr>
-          <w:rFonts w:ascii="Times New Roman" w:hAnsi="Times New Roman" w:cs="Times New Roman"/>
-        </w:rPr>
-        <w:t>BellmanFord</w:t>
-      </w:r>
-      <w:proofErr w:type="spellEnd"/>
-      <w:r>
-        <w:rPr>
-          <w:rFonts w:ascii="Times New Roman" w:hAnsi="Times New Roman" w:cs="Times New Roman"/>
-        </w:rPr>
-        <w:t>(graph, source):</w:t>
+      <w:r>
+        <w:rPr>
+          <w:rFonts w:ascii="Times New Roman" w:hAnsi="Times New Roman" w:cs="Times New Roman"/>
+        </w:rPr>
+        <w:t>BellmanFord(graph, source):</w:t>
       </w:r>
     </w:p>
     <w:p>
@@ -1578,33 +1570,11 @@
         </w:rPr>
         <w:t xml:space="preserve">    </w:t>
       </w:r>
-      <w:proofErr w:type="spellStart"/>
-      <w:r>
-        <w:rPr>
-          <w:rFonts w:ascii="Times New Roman" w:hAnsi="Times New Roman" w:cs="Times New Roman"/>
-        </w:rPr>
-        <w:t>dist</w:t>
-      </w:r>
-      <w:proofErr w:type="spellEnd"/>
-      <w:r>
-        <w:rPr>
-          <w:rFonts w:ascii="Times New Roman" w:hAnsi="Times New Roman" w:cs="Times New Roman"/>
-        </w:rPr>
-        <w:t xml:space="preserve">[all] = INF; </w:t>
-      </w:r>
-      <w:proofErr w:type="spellStart"/>
-      <w:r>
-        <w:rPr>
-          <w:rFonts w:ascii="Times New Roman" w:hAnsi="Times New Roman" w:cs="Times New Roman"/>
-        </w:rPr>
-        <w:t>dist</w:t>
-      </w:r>
-      <w:proofErr w:type="spellEnd"/>
-      <w:r>
-        <w:rPr>
-          <w:rFonts w:ascii="Times New Roman" w:hAnsi="Times New Roman" w:cs="Times New Roman"/>
-        </w:rPr>
-        <w:t>[source] = 0</w:t>
+      <w:r>
+        <w:rPr>
+          <w:rFonts w:ascii="Times New Roman" w:hAnsi="Times New Roman" w:cs="Times New Roman"/>
+        </w:rPr>
+        <w:t>dist[all] = INF; dist[source] = 0</w:t>
       </w:r>
     </w:p>
     <w:p>
@@ -1645,21 +1615,7 @@
         <w:rPr>
           <w:rFonts w:ascii="Times New Roman" w:hAnsi="Times New Roman" w:cs="Times New Roman"/>
         </w:rPr>
-        <w:t>for each edge (</w:t>
-      </w:r>
-      <w:proofErr w:type="spellStart"/>
-      <w:r>
-        <w:rPr>
-          <w:rFonts w:ascii="Times New Roman" w:hAnsi="Times New Roman" w:cs="Times New Roman"/>
-        </w:rPr>
-        <w:t>u,v,w</w:t>
-      </w:r>
-      <w:proofErr w:type="spellEnd"/>
-      <w:r>
-        <w:rPr>
-          <w:rFonts w:ascii="Times New Roman" w:hAnsi="Times New Roman" w:cs="Times New Roman"/>
-        </w:rPr>
-        <w:t>):</w:t>
+        <w:t>for each edge (u,v,w):</w:t>
       </w:r>
     </w:p>
     <w:p>
@@ -1679,35 +1635,7 @@
         <w:rPr>
           <w:rFonts w:ascii="Times New Roman" w:hAnsi="Times New Roman" w:cs="Times New Roman"/>
         </w:rPr>
-        <w:t xml:space="preserve">if </w:t>
-      </w:r>
-      <w:proofErr w:type="spellStart"/>
-      <w:r>
-        <w:rPr>
-          <w:rFonts w:ascii="Times New Roman" w:hAnsi="Times New Roman" w:cs="Times New Roman"/>
-        </w:rPr>
-        <w:t>dist</w:t>
-      </w:r>
-      <w:proofErr w:type="spellEnd"/>
-      <w:r>
-        <w:rPr>
-          <w:rFonts w:ascii="Times New Roman" w:hAnsi="Times New Roman" w:cs="Times New Roman"/>
-        </w:rPr>
-        <w:t xml:space="preserve">[u]+w &lt; </w:t>
-      </w:r>
-      <w:proofErr w:type="spellStart"/>
-      <w:r>
-        <w:rPr>
-          <w:rFonts w:ascii="Times New Roman" w:hAnsi="Times New Roman" w:cs="Times New Roman"/>
-        </w:rPr>
-        <w:t>dist</w:t>
-      </w:r>
-      <w:proofErr w:type="spellEnd"/>
-      <w:r>
-        <w:rPr>
-          <w:rFonts w:ascii="Times New Roman" w:hAnsi="Times New Roman" w:cs="Times New Roman"/>
-        </w:rPr>
-        <w:t>[v]:</w:t>
+        <w:t>if dist[u]+w &lt; dist[v]:</w:t>
       </w:r>
     </w:p>
     <w:p>
@@ -1724,33 +1652,11 @@
         </w:rPr>
         <w:t xml:space="preserve">    </w:t>
       </w:r>
-      <w:proofErr w:type="spellStart"/>
-      <w:r>
-        <w:rPr>
-          <w:rFonts w:ascii="Times New Roman" w:hAnsi="Times New Roman" w:cs="Times New Roman"/>
-        </w:rPr>
-        <w:t>dist</w:t>
-      </w:r>
-      <w:proofErr w:type="spellEnd"/>
-      <w:r>
-        <w:rPr>
-          <w:rFonts w:ascii="Times New Roman" w:hAnsi="Times New Roman" w:cs="Times New Roman"/>
-        </w:rPr>
-        <w:t xml:space="preserve">[v] = </w:t>
-      </w:r>
-      <w:proofErr w:type="spellStart"/>
-      <w:r>
-        <w:rPr>
-          <w:rFonts w:ascii="Times New Roman" w:hAnsi="Times New Roman" w:cs="Times New Roman"/>
-        </w:rPr>
-        <w:t>dist</w:t>
-      </w:r>
-      <w:proofErr w:type="spellEnd"/>
-      <w:r>
-        <w:rPr>
-          <w:rFonts w:ascii="Times New Roman" w:hAnsi="Times New Roman" w:cs="Times New Roman"/>
-        </w:rPr>
-        <w:t>[u]+w</w:t>
+      <w:r>
+        <w:rPr>
+          <w:rFonts w:ascii="Times New Roman" w:hAnsi="Times New Roman" w:cs="Times New Roman"/>
+        </w:rPr>
+        <w:t>dist[v] = dist[u]+w</w:t>
       </w:r>
     </w:p>
     <w:p>
@@ -1904,7 +1810,33 @@
         <w:rPr>
           <w:rFonts w:ascii="Times New Roman" w:hAnsi="Times New Roman" w:cs="Times New Roman"/>
         </w:rPr>
-        <w:t xml:space="preserve"> Bellman-Ford’s algorithm has a best case runtime of O(E) for optimized versions being applied to already optimally organized graphs due to no relaxation being required resulting in early termination. For dense graphs in which E ~= V^2, the required V-1 iterations per vertex increase the runtime to O(V^3).</w:t>
+        <w:t xml:space="preserve"> Bellman-Ford’s algorithm has a best case runtime of O(E) for optimized versions being applied to already optimally organized graphs due to no relaxation being required resulting in early termination. For dense graphs in which E ~= V</w:t>
+      </w:r>
+      <w:r>
+        <w:rPr>
+          <w:rFonts w:ascii="Times New Roman" w:hAnsi="Times New Roman" w:cs="Times New Roman"/>
+          <w:vertAlign w:val="superscript"/>
+        </w:rPr>
+        <w:t>2</w:t>
+      </w:r>
+      <w:r>
+        <w:rPr>
+          <w:rFonts w:ascii="Times New Roman" w:hAnsi="Times New Roman" w:cs="Times New Roman"/>
+        </w:rPr>
+        <w:t>, the required V-1 iterations per vertex increase the runtime to O(V</w:t>
+      </w:r>
+      <w:r>
+        <w:rPr>
+          <w:rFonts w:ascii="Times New Roman" w:hAnsi="Times New Roman" w:cs="Times New Roman"/>
+          <w:vertAlign w:val="superscript"/>
+        </w:rPr>
+        <w:t>3</w:t>
+      </w:r>
+      <w:r>
+        <w:rPr>
+          <w:rFonts w:ascii="Times New Roman" w:hAnsi="Times New Roman" w:cs="Times New Roman"/>
+        </w:rPr>
+        <w:t>).</w:t>
       </w:r>
     </w:p>
     <w:p>
@@ -2102,21 +2034,7 @@
         <w:rPr>
           <w:rFonts w:ascii="Times New Roman" w:hAnsi="Times New Roman" w:cs="Times New Roman"/>
         </w:rPr>
-        <w:t>if w(</w:t>
-      </w:r>
-      <w:proofErr w:type="spellStart"/>
-      <w:r>
-        <w:rPr>
-          <w:rFonts w:ascii="Times New Roman" w:hAnsi="Times New Roman" w:cs="Times New Roman"/>
-        </w:rPr>
-        <w:t>u,v</w:t>
-      </w:r>
-      <w:proofErr w:type="spellEnd"/>
-      <w:r>
-        <w:rPr>
-          <w:rFonts w:ascii="Times New Roman" w:hAnsi="Times New Roman" w:cs="Times New Roman"/>
-        </w:rPr>
-        <w:t>) &lt; key[v]:</w:t>
+        <w:t>if w(u,v) &lt; key[v]:</w:t>
       </w:r>
     </w:p>
     <w:p>
@@ -2137,21 +2055,7 @@
         <w:rPr>
           <w:rFonts w:ascii="Times New Roman" w:hAnsi="Times New Roman" w:cs="Times New Roman"/>
         </w:rPr>
-        <w:t>key[v] = w(</w:t>
-      </w:r>
-      <w:proofErr w:type="spellStart"/>
-      <w:r>
-        <w:rPr>
-          <w:rFonts w:ascii="Times New Roman" w:hAnsi="Times New Roman" w:cs="Times New Roman"/>
-        </w:rPr>
-        <w:t>u,v</w:t>
-      </w:r>
-      <w:proofErr w:type="spellEnd"/>
-      <w:r>
-        <w:rPr>
-          <w:rFonts w:ascii="Times New Roman" w:hAnsi="Times New Roman" w:cs="Times New Roman"/>
-        </w:rPr>
-        <w:t>)</w:t>
+        <w:t>key[v] = w(u,v)</w:t>
       </w:r>
     </w:p>
     <w:p>
@@ -2880,7 +2784,20 @@
         <w:rPr>
           <w:rFonts w:ascii="Times New Roman" w:hAnsi="Times New Roman" w:cs="Times New Roman"/>
         </w:rPr>
-        <w:t>The results show that both BFS and DFS have very similar execution times due to the small size of the graphs used. However, execution time increases as the graph size grows, as seen when comparing the small sparse graph to the large sparse graph. Additionally, both algorithms take longer to execute on the large dense graph compared to sparse graphs, since more edges must be examined. In terms of memory usage, BFS requires additional space for a queue to store nodes at each level, while DFS uses a stack (from recursion) and typically stores fewer nodes at a time. Since the graph is implemented using an adjacency matrix, both algorithms require checking all neighbors for each vertex, resulting in a time complexity of O(V2). The experimental results are consistent with this behavior.</w:t>
+        <w:t>The results show that both BFS and DFS have very similar execution times due to the small size of the graphs used. However, execution time increases as the graph size grows, as seen when comparing the small sparse graph to the large sparse graph. Additionally, both algorithms take longer to execute on the large dense graph compared to sparse graphs, since more edges must be examined. In terms of memory usage, BFS requires additional space for a queue to store nodes at each level, while DFS uses a stack (from recursion) and typically stores fewer nodes at a time. Since the graph is implemented using an adjacency matrix, both algorithms require checking all neighbors for each vertex, resulting in a time complexity of O(V</w:t>
+      </w:r>
+      <w:r>
+        <w:rPr>
+          <w:rFonts w:ascii="Times New Roman" w:hAnsi="Times New Roman" w:cs="Times New Roman"/>
+          <w:vertAlign w:val="superscript"/>
+        </w:rPr>
+        <w:t>2</w:t>
+      </w:r>
+      <w:r>
+        <w:rPr>
+          <w:rFonts w:ascii="Times New Roman" w:hAnsi="Times New Roman" w:cs="Times New Roman"/>
+        </w:rPr>
+        <w:t>). The experimental results are consistent with this behavior.</w:t>
       </w:r>
     </w:p>
     <w:p>
@@ -2905,7 +2822,25 @@
         <w:rPr>
           <w:rFonts w:ascii="Times New Roman" w:hAnsi="Times New Roman" w:cs="Times New Roman"/>
         </w:rPr>
-        <w:t>show that Prim’s algorithm for the minimum spanning tree (MST) has slightly higher execution times compared to BFS and DFS, with a noticeable increase in the large sparse graph. This is because Prim’s algorithm must evaluate edge weights and maintain additional structures to build the spanning tree. Execution time increases as the graph size grows, and variations between sparse and dense graphs are influenced by the number of edges considered. In terms of memory usage, Prim’s algorithm requires extra space to store key values and track selected vertices. With the adjacency matrix representation, all possible edges are checked, leading to a time complexity of O(V</w:t>
+        <w:t xml:space="preserve">show that Prim’s algorithm for the minimum spanning tree (MST) has slightly higher execution times compared to BFS and DFS, with a noticeable increase in the large sparse graph. This is because Prim’s algorithm must evaluate edge weights and maintain additional structures to build the spanning tree. Execution time increases as the graph size grows, and variations between sparse and dense graphs are influenced by the number of edges considered. In terms of memory usage, Prim’s algorithm requires </w:t>
+      </w:r>
+      <w:r>
+        <w:rPr>
+          <w:rFonts w:ascii="Times New Roman" w:hAnsi="Times New Roman" w:cs="Times New Roman"/>
+        </w:rPr>
+        <w:t>extra space to store key values, a parent array to track the selected edges, and a visited array to track MST membership</w:t>
+      </w:r>
+      <w:r>
+        <w:rPr>
+          <w:rFonts w:ascii="Times New Roman" w:hAnsi="Times New Roman" w:cs="Times New Roman"/>
+        </w:rPr>
+        <w:t>.</w:t>
+      </w:r>
+      <w:r>
+        <w:rPr>
+          <w:rFonts w:ascii="Times New Roman" w:hAnsi="Times New Roman" w:cs="Times New Roman"/>
+        </w:rPr>
+        <w:t xml:space="preserve"> With the adjacency matrix representation, all possible edges are checked, leading to a time complexity of O(V</w:t>
       </w:r>
       <w:r>
         <w:rPr>
@@ -2931,20 +2866,14 @@
         <w:rPr>
           <w:rFonts w:ascii="Times New Roman" w:hAnsi="Times New Roman" w:cs="Times New Roman"/>
         </w:rPr>
+        <w:lastRenderedPageBreak/>
         <w:t xml:space="preserve">Finally, </w:t>
       </w:r>
       <w:r>
         <w:rPr>
           <w:rFonts w:ascii="Times New Roman" w:hAnsi="Times New Roman" w:cs="Times New Roman"/>
         </w:rPr>
-        <w:t xml:space="preserve">the Bellman-Ford algorithm has the highest execution times among all algorithms tested. This is expected, as Bellman-Ford repeatedly relaxes all edges to compute shortest paths, </w:t>
-      </w:r>
-      <w:r>
-        <w:rPr>
-          <w:rFonts w:ascii="Times New Roman" w:hAnsi="Times New Roman" w:cs="Times New Roman"/>
-        </w:rPr>
-        <w:lastRenderedPageBreak/>
-        <w:t xml:space="preserve">resulting in more computations even for smaller graphs. Unlike BFS and DFS, its performance does not vary significantly between sparse and dense graphs due to its dependence on repeatedly processing all edges. In terms of memory usage, Bellman-Ford requires additional space to store </w:t>
+        <w:t xml:space="preserve">the Bellman-Ford algorithm has the highest execution times among all algorithms tested. This is expected, as Bellman-Ford repeatedly relaxes all edges to compute shortest paths, resulting in more computations even for smaller graphs. Unlike BFS and DFS, its performance does not vary significantly between sparse and dense graphs due to its dependence on repeatedly processing all edges. In terms of memory usage, Bellman-Ford requires additional space to store </w:t>
       </w:r>
       <w:r>
         <w:rPr>
@@ -3292,7 +3221,6 @@
         <w:rPr>
           <w:rFonts w:ascii="Times New Roman" w:hAnsi="Times New Roman" w:cs="Times New Roman"/>
         </w:rPr>
-        <w:lastRenderedPageBreak/>
         <w:t>The project was completed collaboratively, with each team member contributing to specific components of the design, implementation, and analysis of graph algorithms.</w:t>
       </w:r>
     </w:p>

</xml_diff>